<commit_message>
fixed cron and bash para estadisticas
</commit_message>
<xml_diff>
--- a/translation_validator_tool/metrics/documents/Metricas_Plataforma.docx
+++ b/translation_validator_tool/metrics/documents/Metricas_Plataforma.docx
@@ -12,7 +12,7 @@
           <w:color w:val="0066CC"/>
           <w:sz w:val="28"/>
         </w:rPr>
-        <w:t xml:space="preserve"> REPORTE DE MÉTRICAS - 2026-04-30 00:23:03</w:t>
+        <w:t xml:space="preserve"> REPORTE DE MÉTRICAS - 2026-05-04 02:42:56</w:t>
       </w:r>
     </w:p>
     <w:p>
@@ -31,7 +31,7 @@
     </w:p>
     <w:p>
       <w:r>
-        <w:t>Total de usuarios: 86</w:t>
+        <w:t>Total de usuarios: 91</w:t>
       </w:r>
     </w:p>
     <w:p>
@@ -44,7 +44,7 @@
         <w:pStyle w:val="ListBullet2"/>
       </w:pPr>
       <w:r>
-        <w:t xml:space="preserve">  • 2026-04-28: 4</w:t>
+        <w:t xml:space="preserve">  • 2026-05-02: 1</w:t>
       </w:r>
     </w:p>
     <w:p>
@@ -52,7 +52,7 @@
         <w:pStyle w:val="ListBullet2"/>
       </w:pPr>
       <w:r>
-        <w:t xml:space="preserve">  • 2026-04-29: 2</w:t>
+        <w:t xml:space="preserve">  • 2026-05-03: 1</w:t>
       </w:r>
     </w:p>
     <w:p>
@@ -66,12 +66,12 @@
     </w:p>
     <w:p>
       <w:r>
-        <w:t>Traducciones completadas (total): 20</w:t>
+        <w:t>Traducciones completadas (total): 32</w:t>
       </w:r>
     </w:p>
     <w:p>
       <w:r>
-        <w:t>Traducciones completadas (últimos 2 días): 9</w:t>
+        <w:t>Traducciones completadas (últimos 2 días): 2</w:t>
       </w:r>
     </w:p>
     <w:p>
@@ -85,17 +85,17 @@
     </w:p>
     <w:p>
       <w:r>
-        <w:t>Total de premisas asignadas: 490</w:t>
+        <w:t>Total de premisas asignadas: 555</w:t>
       </w:r>
     </w:p>
     <w:p>
       <w:r>
-        <w:t>Premisas asignadas (últimos 2 días): 145</w:t>
+        <w:t>Premisas asignadas (últimos 2 días): 15</w:t>
       </w:r>
     </w:p>
     <w:p>
       <w:r>
-        <w:t>Premisas tomadas por usuarios: 329/720</w:t>
+        <w:t>Premisas tomadas por usuarios: 351/720</w:t>
       </w:r>
     </w:p>
     <w:p>
@@ -109,17 +109,17 @@
     </w:p>
     <w:p>
       <w:r>
-        <w:t>Premisas con al menos una traducción: 194</w:t>
+        <w:t>Premisas con al menos una traducción: 230</w:t>
       </w:r>
     </w:p>
     <w:p>
       <w:r>
-        <w:t>Premisas sin traducciones: 576</w:t>
+        <w:t>Premisas sin traducciones: 540</w:t>
       </w:r>
     </w:p>
     <w:p>
       <w:r>
-        <w:t>Premisas asignadas pero SIN traducción por el momento: 135</w:t>
+        <w:t>Premisas asignadas pero SIN traducción por el momento: 121</w:t>
       </w:r>
     </w:p>
     <w:p>

</xml_diff>